<commit_message>
fix(resume): deduplicate recommendations, improve bullet-level feedback quality, and sanitize test fixtures
</commit_message>
<xml_diff>
--- a/services/resume-service/tests/fixtures/candidate_resume.docx
+++ b/services/resume-service/tests/fixtures/candidate_resume.docx
@@ -7,12 +7,12 @@
         <w:pStyle w:val="Title"/>
       </w:pPr>
       <w:r>
-        <w:t>JASWANTH REDDY</w:t>
+        <w:t>ALEX MORGAN</w:t>
       </w:r>
     </w:p>
     <w:p>
       <w:r>
-        <w:t>Hyderabad, Telangana, India | +91 8008154808 | jaswanthre9@gmail.com | linkedin.com/in/jasreaug | github.com/Jaswanth-Reddy-2006</w:t>
+        <w:t>San Francisco, CA | +1 (555) 234-5678 | alex.morgan@example.com | linkedin.com/in/alexmorgan-dev | github.com/alexmorgan-tech</w:t>
       </w:r>
     </w:p>
     <w:p>

</xml_diff>